<commit_message>
chore: replace syntax text from user to planist
</commit_message>
<xml_diff>
--- a/project/core/logic/templates/report_template.docx
+++ b/project/core/logic/templates/report_template.docx
@@ -104,7 +104,15 @@
           <w:szCs w:val="24"/>
           <w:lang w:val="pl-PL"/>
         </w:rPr>
-        <w:t>Użytkownik: {{USER}}</w:t>
+        <w:t>Planista</w:t>
+      </w:r>
+      <w:r>
+        <w:rPr>
+          <w:sz w:val="24"/>
+          <w:szCs w:val="24"/>
+          <w:lang w:val="pl-PL"/>
+        </w:rPr>
+        <w:t>: {{USER}}</w:t>
       </w:r>
     </w:p>
     <w:p>

</xml_diff>